<commit_message>
Deep learning every week class
</commit_message>
<xml_diff>
--- a/Quiz1.docx
+++ b/Quiz1.docx
@@ -295,10 +295,8 @@
           <w:szCs w:val="40"/>
           <w14:ligatures w14:val="none"/>
         </w:rPr>
-        <w:t xml:space="preserve">Student </w:t>
-      </w:r>
-      <w:proofErr w:type="spellStart"/>
-      <w:proofErr w:type="gramStart"/>
+        <w:t>Student name:</w:t>
+      </w:r>
       <w:r>
         <w:rPr>
           <w:rFonts w:ascii="Times New Roman" w:eastAsia="Times New Roman" w:hAnsi="Times New Roman" w:cs="Times New Roman"/>
@@ -309,7 +307,7 @@
           <w:szCs w:val="40"/>
           <w14:ligatures w14:val="none"/>
         </w:rPr>
-        <w:t>name:</w:t>
+        <w:t xml:space="preserve"> </w:t>
       </w:r>
       <w:r>
         <w:rPr>
@@ -321,21 +319,7 @@
           <w:szCs w:val="40"/>
           <w14:ligatures w14:val="none"/>
         </w:rPr>
-        <w:t>Yatish</w:t>
-      </w:r>
-      <w:proofErr w:type="spellEnd"/>
-      <w:proofErr w:type="gramEnd"/>
-      <w:r>
-        <w:rPr>
-          <w:rFonts w:ascii="Times New Roman" w:eastAsia="Times New Roman" w:hAnsi="Times New Roman" w:cs="Times New Roman"/>
-          <w:b/>
-          <w:bCs/>
-          <w:kern w:val="0"/>
-          <w:sz w:val="40"/>
-          <w:szCs w:val="40"/>
-          <w14:ligatures w14:val="none"/>
-        </w:rPr>
-        <w:t xml:space="preserve"> Durga Appanapalli</w:t>
+        <w:t>Yatish Durga Appanapalli</w:t>
       </w:r>
     </w:p>
     <w:p>

</xml_diff>